<commit_message>
Adicionado como instalar o Jenkins
</commit_message>
<xml_diff>
--- a/codigos.docx
+++ b/codigos.docx
@@ -182,6 +182,21 @@
       </w:pPr>
       <w:r>
         <w:rPr/>
+        <w:t xml:space="preserve">ao colocar o caminho para a palavra passe gerada na primeira vez colocar </w:t>
+      </w:r>
+      <w:r>
+        <w:rPr>
+          <w:b/>
+          <w:bCs/>
+        </w:rPr>
+        <w:t xml:space="preserve">sudo more </w:t>
+      </w:r>
+      <w:r>
+        <w:rPr>
+          <w:b w:val="false"/>
+          <w:bCs w:val="false"/>
+        </w:rPr>
+        <w:t>antes no bash</w:t>
       </w:r>
     </w:p>
     <w:p>
@@ -753,6 +768,7 @@
     <w:rsid w:val="00cf1c32"/>
     <w:pPr>
       <w:widowControl/>
+      <w:suppressAutoHyphens w:val="true"/>
       <w:bidi w:val="0"/>
       <w:spacing w:lineRule="auto" w:line="276" w:before="0" w:after="160"/>
       <w:jc w:val="left"/>

</xml_diff>